<commit_message>
Update quote example with embedded images
The generated quote now includes:
- Company logo in the header
- Product images in the products table
- All images are colorful placeholders generated locally

🤖 Generated with [Claude Code](https://claude.com/claude-code)

Co-Authored-By: Claude <noreply@anthropic.com>
</commit_message>
<xml_diff>
--- a/quote_example.docx
+++ b/quote_example.docx
@@ -2,6 +2,45 @@
 <file path=word/document.xml><?xml version="1.0" encoding="utf-8"?>
 <w:document xmlns:wpc="http://schemas.microsoft.com/office/word/2010/wordprocessingCanvas" xmlns:mo="http://schemas.microsoft.com/office/mac/office/2008/main" xmlns:mc="http://schemas.openxmlformats.org/markup-compatibility/2006" xmlns:mv="urn:schemas-microsoft-com:mac:vml" xmlns:o="urn:schemas-microsoft-com:office:office" xmlns:r="http://schemas.openxmlformats.org/officeDocument/2006/relationships" xmlns:m="http://schemas.openxmlformats.org/officeDocument/2006/math" xmlns:v="urn:schemas-microsoft-com:vml" xmlns:wp14="http://schemas.microsoft.com/office/word/2010/wordprocessingDrawing" xmlns:wp="http://schemas.openxmlformats.org/drawingml/2006/wordprocessingDrawing" xmlns:w10="urn:schemas-microsoft-com:office:word" xmlns:w="http://schemas.openxmlformats.org/wordprocessingml/2006/main" xmlns:w14="http://schemas.microsoft.com/office/word/2010/wordml" xmlns:wpg="http://schemas.microsoft.com/office/word/2010/wordprocessingGroup" xmlns:wpi="http://schemas.microsoft.com/office/word/2010/wordprocessingInk" xmlns:wne="http://schemas.microsoft.com/office/word/2006/wordml" xmlns:wps="http://schemas.microsoft.com/office/word/2010/wordprocessingShape" mc:Ignorable="w14 wp14">
   <w:body>
+    <w:p>
+      <w:pPr>
+        <w:jc w:val="center"/>
+      </w:pPr>
+      <w:r>
+        <w:drawing>
+          <wp:inline xmlns:a="http://schemas.openxmlformats.org/drawingml/2006/main" xmlns:pic="http://schemas.openxmlformats.org/drawingml/2006/picture">
+            <wp:extent cx="2286000" cy="1143000"/>
+            <wp:docPr id="1" name="Picture 1"/>
+            <wp:cNvGraphicFramePr>
+              <a:graphicFrameLocks noChangeAspect="1"/>
+            </wp:cNvGraphicFramePr>
+            <a:graphic>
+              <a:graphicData uri="http://schemas.openxmlformats.org/drawingml/2006/picture">
+                <pic:pic>
+                  <pic:nvPicPr>
+                    <pic:cNvPr id="0" name="image.png"/>
+                    <pic:cNvPicPr/>
+                  </pic:nvPicPr>
+                  <pic:blipFill>
+                    <a:blip r:embed="rId9"/>
+                    <a:stretch>
+                      <a:fillRect/>
+                    </a:stretch>
+                  </pic:blipFill>
+                  <pic:spPr>
+                    <a:xfrm>
+                      <a:off x="0" y="0"/>
+                      <a:ext cx="2286000" cy="1143000"/>
+                    </a:xfrm>
+                    <a:prstGeom prst="rect"/>
+                  </pic:spPr>
+                </pic:pic>
+              </a:graphicData>
+            </a:graphic>
+          </wp:inline>
+        </w:drawing>
+      </w:r>
+    </w:p>
     <w:p>
       <w:pPr>
         <w:jc w:val="center"/>
@@ -439,7 +478,38 @@
               <w:jc w:val="center"/>
             </w:pPr>
             <w:r>
-              <w:t>[IMAGEN]</w:t>
+              <w:drawing>
+                <wp:inline xmlns:a="http://schemas.openxmlformats.org/drawingml/2006/main" xmlns:pic="http://schemas.openxmlformats.org/drawingml/2006/picture">
+                  <wp:extent cx="1097280" cy="1097280"/>
+                  <wp:docPr id="2" name="Picture 2"/>
+                  <wp:cNvGraphicFramePr>
+                    <a:graphicFrameLocks noChangeAspect="1"/>
+                  </wp:cNvGraphicFramePr>
+                  <a:graphic>
+                    <a:graphicData uri="http://schemas.openxmlformats.org/drawingml/2006/picture">
+                      <pic:pic>
+                        <pic:nvPicPr>
+                          <pic:cNvPr id="0" name="image.png"/>
+                          <pic:cNvPicPr/>
+                        </pic:nvPicPr>
+                        <pic:blipFill>
+                          <a:blip r:embed="rId10"/>
+                          <a:stretch>
+                            <a:fillRect/>
+                          </a:stretch>
+                        </pic:blipFill>
+                        <pic:spPr>
+                          <a:xfrm>
+                            <a:off x="0" y="0"/>
+                            <a:ext cx="1097280" cy="1097280"/>
+                          </a:xfrm>
+                          <a:prstGeom prst="rect"/>
+                        </pic:spPr>
+                      </pic:pic>
+                    </a:graphicData>
+                  </a:graphic>
+                </wp:inline>
+              </w:drawing>
             </w:r>
           </w:p>
         </w:tc>
@@ -561,7 +631,38 @@
               <w:jc w:val="center"/>
             </w:pPr>
             <w:r>
-              <w:t>[IMAGEN]</w:t>
+              <w:drawing>
+                <wp:inline xmlns:a="http://schemas.openxmlformats.org/drawingml/2006/main" xmlns:pic="http://schemas.openxmlformats.org/drawingml/2006/picture">
+                  <wp:extent cx="1097280" cy="1097280"/>
+                  <wp:docPr id="3" name="Picture 3"/>
+                  <wp:cNvGraphicFramePr>
+                    <a:graphicFrameLocks noChangeAspect="1"/>
+                  </wp:cNvGraphicFramePr>
+                  <a:graphic>
+                    <a:graphicData uri="http://schemas.openxmlformats.org/drawingml/2006/picture">
+                      <pic:pic>
+                        <pic:nvPicPr>
+                          <pic:cNvPr id="0" name="image.png"/>
+                          <pic:cNvPicPr/>
+                        </pic:nvPicPr>
+                        <pic:blipFill>
+                          <a:blip r:embed="rId11"/>
+                          <a:stretch>
+                            <a:fillRect/>
+                          </a:stretch>
+                        </pic:blipFill>
+                        <pic:spPr>
+                          <a:xfrm>
+                            <a:off x="0" y="0"/>
+                            <a:ext cx="1097280" cy="1097280"/>
+                          </a:xfrm>
+                          <a:prstGeom prst="rect"/>
+                        </pic:spPr>
+                      </pic:pic>
+                    </a:graphicData>
+                  </a:graphic>
+                </wp:inline>
+              </w:drawing>
             </w:r>
           </w:p>
         </w:tc>
@@ -1133,7 +1234,7 @@
       </w:r>
     </w:p>
     <w:sectPr>
-      <w:footerReference w:type="default" r:id="rId9"/>
+      <w:footerReference w:type="default" r:id="rId12"/>
       <w:pgSz w:w="12240" w:h="15840"/>
       <w:pgMar w:top="1440" w:right="1800" w:bottom="1440" w:left="1800" w:header="720" w:footer="720" w:gutter="0"/>
       <w:cols w:space="720"/>

</xml_diff>